<commit_message>
court(wvactapp): answering brief regenerated, counsel at the cover's foot, the conclusion kept with its signature; latex and docx still reported (fb-595.54.66)
Co-Authored-By: Claude Opus 5.5 <noreply@anthropic.com>
</commit_message>
<xml_diff>
--- a/courts/fourth-circuit/west-virginia/state/intermediate-court-of-appeals/answering-brief/usage/OUTPUT-answering-brief.docx
+++ b/courts/fourth-circuit/west-virginia/state/intermediate-court-of-appeals/answering-brief/usage/OUTPUT-answering-brief.docx
@@ -511,7 +511,12 @@
     </w:p>
     <w:p>
       <w:pPr>
-        <w:spacing w:before="1728" w:after="0" w:line="276" w:lineRule="exact"/>
+        <w:spacing w:before="0" w:after="0" w:line="6374" w:lineRule="exact"/>
+      </w:pPr>
+    </w:p>
+    <w:p>
+      <w:pPr>
+        <w:spacing w:before="0" w:after="0" w:line="276" w:lineRule="exact"/>
         <w:ind w:left="4608" w:firstLine="0"/>
         <w:jc w:val="left"/>
       </w:pPr>
@@ -2010,7 +2015,7 @@
         <w:tab/>
       </w:r>
       <w:r>
-        <w:t xml:space="preserve">17</w:t>
+        <w:t xml:space="preserve">18</w:t>
       </w:r>
     </w:p>
     <w:p>
@@ -2240,7 +2245,7 @@
         <w:tab/>
       </w:r>
       <w:r>
-        <w:t xml:space="preserve">19</w:t>
+        <w:t xml:space="preserve">20</w:t>
       </w:r>
     </w:p>
     <w:p>
@@ -2721,7 +2726,7 @@
         <w:tab/>
       </w:r>
       <w:r>
-        <w:t xml:space="preserve">4, 14</w:t>
+        <w:t xml:space="preserve">4, 15</w:t>
       </w:r>
     </w:p>
     <w:p>
@@ -3605,7 +3610,7 @@
           <w:tab w:val="right" w:leader="dot" w:pos="9360"/>
         </w:tabs>
         <w:spacing w:before="216" w:after="0" w:line="276" w:lineRule="exact"/>
-        <w:ind w:left="360" w:right="1440" w:hanging="360"/>
+        <w:ind w:left="360" w:right="1200" w:hanging="360"/>
       </w:pPr>
       <w:r>
         <w:t xml:space="preserve">W.</w:t>
@@ -3645,7 +3650,7 @@
         <w:tab/>
       </w:r>
       <w:r>
-        <w:t xml:space="preserve">1, 2, 3, 4, 6, 19</w:t>
+        <w:t xml:space="preserve">1, 2, 4, 6, 19</w:t>
       </w:r>
     </w:p>
     <w:p>
@@ -3795,7 +3800,7 @@
         <w:tab/>
       </w:r>
       <w:r>
-        <w:t xml:space="preserve">2, 3, 17, 19</w:t>
+        <w:t xml:space="preserve">2, 3, 17, 20</w:t>
       </w:r>
     </w:p>
     <w:p>
@@ -4673,19 +4678,7 @@
         <w:pStyle w:val="BodyText"/>
       </w:pPr>
       <w:r>
-        <w:t xml:space="preserve">Ronald Keller experienced frequent and intense exposure to the hazards of products that contained benzene for 15+ years in his employment as a roofer. The current state of the scientific literature supports a relationship between benzene exposure and myelodysplastic syndrome. As such, Mr. Keller met the requirements set forth in W. Va. Code § 23</w:t>
-      </w:r>
-      <w:r>
-        <w:noBreakHyphen/>
-      </w:r>
-      <w:r>
-        <w:t xml:space="preserve">4</w:t>
-      </w:r>
-      <w:r>
-        <w:noBreakHyphen/>
-      </w:r>
-      <w:r>
-        <w:t xml:space="preserve">1</w:t>
+        <w:t xml:space="preserve">Ronald Keller experienced frequent and intense exposure to the hazards of products that contained benzene for 15+ years in his employment as a roofer. The current state of the scientific literature supports a relationship between benzene exposure and myelodysplastic syndrome. As such, Mr. Keller met the requirements set forth in W. Va. Code § 23-⁠4-⁠1</w:t>
       </w:r>
       <w:r>
         <w:t xml:space="preserve"> </w:t>
@@ -4903,19 +4896,7 @@
         <w:pStyle w:val="BodyText"/>
       </w:pPr>
       <w:r>
-        <w:t xml:space="preserve">The standard of review for this matter is contained in W. Va. Code § 23</w:t>
-      </w:r>
-      <w:r>
-        <w:noBreakHyphen/>
-      </w:r>
-      <w:r>
-        <w:t xml:space="preserve">5</w:t>
-      </w:r>
-      <w:r>
-        <w:noBreakHyphen/>
-      </w:r>
-      <w:r>
-        <w:t xml:space="preserve">12a(b).</w:t>
+        <w:t xml:space="preserve">The standard of review for this matter is contained in W. Va. Code § 23-⁠5-⁠12a(b).</w:t>
       </w:r>
     </w:p>
     <w:p>
@@ -4931,19 +4912,7 @@
         <w:pStyle w:val="BodyText"/>
       </w:pPr>
       <w:r>
-        <w:t xml:space="preserve">W.Va. Code § 23</w:t>
-      </w:r>
-      <w:r>
-        <w:noBreakHyphen/>
-      </w:r>
-      <w:r>
-        <w:t xml:space="preserve">5</w:t>
-      </w:r>
-      <w:r>
-        <w:noBreakHyphen/>
-      </w:r>
-      <w:r>
-        <w:t xml:space="preserve">12a(b)</w:t>
+        <w:t xml:space="preserve">W.Va. Code § 23-⁠5-⁠12a(b)</w:t>
       </w:r>
       <w:r>
         <w:t xml:space="preserve"> </w:t>
@@ -4957,37 +4926,13 @@
         <w:pStyle w:val="BodyText"/>
       </w:pPr>
       <w:r>
-        <w:t xml:space="preserve">Recently enacted W.Va. Code § 23</w:t>
-      </w:r>
-      <w:r>
-        <w:noBreakHyphen/>
-      </w:r>
-      <w:r>
-        <w:t xml:space="preserve">5</w:t>
-      </w:r>
-      <w:r>
-        <w:noBreakHyphen/>
-      </w:r>
-      <w:r>
-        <w:t xml:space="preserve">12a(b)</w:t>
-      </w:r>
-      <w:r>
-        <w:t xml:space="preserve"> </w:t>
-      </w:r>
-      <w:r>
-        <w:t xml:space="preserve">contains exactly the same standard previously required of the former Board of Review in reviewing Office of Judges’ decisions. Given the review standards’ similarity, prior rulings of the West Virginia Supreme Court of Appeals discussing the former Board of Review’s obligations in considering decisions of the former Office of Judges are informative. As the Court has stated, “The legislature has seen the need to craft bright lines between rulings by the OOJ and review of those rulings by the Appeal Board. The legislature has determined by its enactment of W. Va. Code § 23</w:t>
-      </w:r>
-      <w:r>
-        <w:noBreakHyphen/>
-      </w:r>
-      <w:r>
-        <w:t xml:space="preserve">5</w:t>
-      </w:r>
-      <w:r>
-        <w:noBreakHyphen/>
-      </w:r>
-      <w:r>
-        <w:t xml:space="preserve">12(b)</w:t>
+        <w:t xml:space="preserve">Recently enacted W.Va. Code § 23-⁠5-⁠12a(b)</w:t>
+      </w:r>
+      <w:r>
+        <w:t xml:space="preserve"> </w:t>
+      </w:r>
+      <w:r>
+        <w:t xml:space="preserve">contains exactly the same standard previously required of the former Board of Review in reviewing Office of Judges’ decisions. Given the review standards’ similarity, prior rulings of the West Virginia Supreme Court of Appeals discussing the former Board of Review’s obligations in considering decisions of the former Office of Judges are informative. As the Court has stated, “The legislature has seen the need to craft bright lines between rulings by the OOJ and review of those rulings by the Appeal Board. The legislature has determined by its enactment of W. Va. Code § 23-⁠5-⁠12(b)</w:t>
       </w:r>
       <w:r>
         <w:t xml:space="preserve"> </w:t>
@@ -5149,7 +5094,7 @@
         <w:pStyle w:val="BodyText"/>
       </w:pPr>
       <w:r>
-        <w:t xml:space="preserve">involves a mode of logical reasoning often described as ‘‘inference to the best explanation,’’ in which the conclusion is not guaranteed by the premises . . . [I]nference to the best explanation can be thought of as involving six general steps, some of which may be implicit. The scientist must (1) identify an association between an exposure and a disease, (2) consider a range of plausible explanations for the association, (3) rank the rival explanations according to their plausibility, (4) seek additional evidence to separate the more plausible from the less plausible explanations, (5) consider all of the relevant available evidence, and (6) integrate the evidence using professional judgment to come to a conclusion about the best explanation.</w:t>
+        <w:t xml:space="preserve">involves a mode of logical reasoning often described as ‘‘inference to the best explanation,’’ in which the conclusion is not guaranteed by the premises . . . [I]nference to the best explanation can be thought of as involving six general steps, some of which may be implicit. The scientist must (1) identify an association between an exposure and a disease, (2) consider a range of plausible explanations for the association, (3) rank the rival explanations according to their plausibility, (4) seek additional evidence to separate the more plausible from the less plausible explanations, (5) consider all of the relevant available evidence, and (6) integrate the evidence using professional judgment to come to a conclusion about the best explanation.</w:t>
       </w:r>
     </w:p>
     <w:p>
@@ -5279,19 +5224,7 @@
         <w:pStyle w:val="BodyText"/>
       </w:pPr>
       <w:r>
-        <w:t xml:space="preserve">W.Va. Code § 23</w:t>
-      </w:r>
-      <w:r>
-        <w:noBreakHyphen/>
-      </w:r>
-      <w:r>
-        <w:t xml:space="preserve">4</w:t>
-      </w:r>
-      <w:r>
-        <w:noBreakHyphen/>
-      </w:r>
-      <w:r>
-        <w:t xml:space="preserve">1</w:t>
+        <w:t xml:space="preserve">W.Va. Code § 23-⁠4-⁠1</w:t>
       </w:r>
       <w:r>
         <w:t xml:space="preserve"> </w:t>
@@ -6385,7 +6318,7 @@
         <w:pStyle w:val="BodyTextNote"/>
       </w:pPr>
       <w:r>
-        <w:t xml:space="preserve">Dr. Rose explained that from the early 1990s to cancer diagnosis Mr. Keller’s “primary work involved repairing roofs using coatings, adhesives, primers and sealants . . . most of which contained significant (30%</w:t>
+        <w:t xml:space="preserve">Dr. Rose explained that from the early 1990s to cancer diagnosis Mr. Keller’s “primary work involved repairing roofs using coatings, adhesives, primers and sealants . . . most of which contained significant (30%</w:t>
       </w:r>
       <w:r>
         <w:noBreakHyphen/>
@@ -7242,7 +7175,7 @@
         <w:noBreakHyphen/>
       </w:r>
       <w:r>
-        <w:t xml:space="preserve">1 Roofing and Trigg Construction. As the Board of Review found, “[T]he Claimant’s cumulative occupational exposures to benzene while working in the state of West Virginia must be considered in determining the compensability of this claim. . . to the extent that Dr. Martin considered only the Claimant’s occupational exposures while working for CCRR, his report fails</w:t>
+        <w:t xml:space="preserve">1 Roofing and Trigg Construction. As the Board of Review found, “[T]he Claimant’s cumulative occupational exposures to benzene while working in the state of West Virginia must be considered in determining the compensability of this claim. . . to the extent that Dr. Martin considered only the Claimant’s occupational exposures while working for CCRR, his report fails</w:t>
       </w:r>
     </w:p>
     <w:p>
@@ -7594,7 +7527,7 @@
         <w:pStyle w:val="BodyTextNote"/>
       </w:pPr>
       <w:r>
-        <w:t xml:space="preserve">Mr. Keller has a medical history that is strongly consistent with his regular, consistent occupational exposure to benzene products. . . being the direct causative factor resulting in his diagnosis of myelodysplastic syndrome. In the patient’s case, his relative young age at diagnosis along with his bone marrow suffering from abnormal blood cell formation affecting all 3 main blood cell lines (white blood cell, red blood cell, and platelet cell lines) were both features that raised the clinical concern of a carcinogen exposure. Furthermore the patient had findings of high-grade abnormalities including the bone marrow genetic changes [monosomy 7] and high blast cell percentage of 18% [demonstrating that] the white blood cells are “stuck” in an abnormal stage of development, and unable to mature into normal adult white blood cells. This constellation of findings is immediately unusual for a patient around [age] 50, as the median age of this bone marrow cancer is 70 years. Secondly, the patient’s cytogenetic abnormality of monosomy 7 is also consistent with bone marrow toxin exposure, and in some series this has been the most common bone marrow abnormality discovered in patients. Importantly, Mr. Keller had occupational exposure to multiple benzene-containing products per day, for several hours per day, 5 to 7 days per week, and over 25 years in his work as a roofer. Supported by the published literature regarding the carcinogenic risk of benzene and its link with myelodysplastic syndrome, the patient’s smoking history is felt to be comparatively minuscule when contrasted with his substantial chronic occupational exposure to benzene.</w:t>
+        <w:t xml:space="preserve">Mr. Keller has a medical history that is strongly consistent with his regular, consistent occupational exposure to benzene products. . . being the direct causative factor resulting in his diagnosis of myelodysplastic syndrome. In the patient’s case, his relative young age at diagnosis along with his bone marrow suffering from abnormal blood cell formation affecting all 3 main blood cell lines (white blood cell, red blood cell, and platelet cell lines) were both features that raised the clinical concern of a carcinogen exposure. Furthermore the patient had findings of high-grade abnormalities including the bone marrow genetic changes [monosomy 7] and high blast cell percentage of 18% [demonstrating that] the white blood cells are “stuck” in an abnormal stage of development, and unable to mature into normal adult white blood cells. This constellation of findings is immediately unusual for a patient around [age] 50, as the median age of this bone marrow cancer is 70 years. Secondly, the patient’s cytogenetic abnormality of monosomy 7 is also consistent with bone marrow toxin exposure, and in some series this has been the most common bone marrow abnormality discovered in patients. Importantly, Mr. Keller had occupational exposure to multiple benzene-containing products per day, for several hours per day, 5 to 7 days per week, and over 25 years in his work as a roofer. Supported by the published literature regarding the carcinogenic risk of benzene and its link with myelodysplastic syndrome, the patient’s smoking history is felt to be comparatively minuscule when contrasted with his substantial chronic occupational exposure to benzene.</w:t>
       </w:r>
       <w:r>
         <w:rPr>
@@ -7906,19 +7839,7 @@
         <w:pStyle w:val="BodyText"/>
       </w:pPr>
       <w:r>
-        <w:t xml:space="preserve">Under W. Va. Code § 23</w:t>
-      </w:r>
-      <w:r>
-        <w:noBreakHyphen/>
-      </w:r>
-      <w:r>
-        <w:t xml:space="preserve">5</w:t>
-      </w:r>
-      <w:r>
-        <w:noBreakHyphen/>
-      </w:r>
-      <w:r>
-        <w:t xml:space="preserve">12a(b),</w:t>
+        <w:t xml:space="preserve">Under W. Va. Code § 23-⁠5-⁠12a(b),</w:t>
       </w:r>
       <w:r>
         <w:t xml:space="preserve"> </w:t>
@@ -8782,19 +8703,7 @@
         <w:pStyle w:val="BodyText"/>
       </w:pPr>
       <w:r>
-        <w:t xml:space="preserve">Respondent met his burden of proof required by W.Va. Code § 23</w:t>
-      </w:r>
-      <w:r>
-        <w:noBreakHyphen/>
-      </w:r>
-      <w:r>
-        <w:t xml:space="preserve">4</w:t>
-      </w:r>
-      <w:r>
-        <w:noBreakHyphen/>
-      </w:r>
-      <w:r>
-        <w:t xml:space="preserve">1</w:t>
+        <w:t xml:space="preserve">Respondent met his burden of proof required by W.Va. Code § 23-⁠4-⁠1</w:t>
       </w:r>
       <w:r>
         <w:t xml:space="preserve"> </w:t>
@@ -8919,7 +8828,7 @@
     </w:p>
     <w:p>
       <w:pPr>
-        <w:pStyle w:val="BodyText"/>
+        <w:pStyle w:val="BodyTextKeep"/>
       </w:pPr>
       <w:r>
         <w:t xml:space="preserve">Petitioner has failed to demonstrate that the Board of Review was clearly wrong or in error in view of the reliable, probative, and substantial evidence on the whole record as required by W. Va. Code §23</w:t>
@@ -8939,6 +8848,8 @@
     </w:p>
     <w:p>
       <w:pPr>
+        <w:keepNext/>
+        <w:keepLines/>
         <w:spacing w:before="0" w:after="0" w:line="432" w:lineRule="exact"/>
       </w:pPr>
     </w:p>
@@ -10243,7 +10154,7 @@
         <w:noBreakHyphen/>
       </w:r>
       <w:r>
-        <w:t xml:space="preserve">12, R.A. 000031. Benzene exposure from rubber glue application has been calculated at 53 parts per million (ppm) by researchers at the National Cancer Institute. Validating the exposure assessment of NCI’s Chinese benzene study, the authors reported that “[t]he highest benzene exposure was observed among rubber workers, especially among rubber glue applicators. . . with an average estimated exposure level of 53 ppm. . .” Dosemeci,</w:t>
+        <w:t xml:space="preserve">12, R.A. 000031. Benzene exposure from rubber glue application has been calculated at 53 parts per million (ppm) by researchers at the National Cancer Institute. Validating the exposure assessment of NCI’s Chinese benzene study, the authors reported that “[t]he highest benzene exposure was observed among rubber workers, especially among rubber glue applicators. . . with an average estimated exposure level of 53 ppm. . .” Dosemeci,</w:t>
       </w:r>
       <w:r>
         <w:t xml:space="preserve"> </w:t>
@@ -10532,7 +10443,7 @@
         <w:t xml:space="preserve"> </w:t>
       </w:r>
       <w:r>
-        <w:t xml:space="preserve">Rose Report, Id. n. 15. See also, Martyn Smith June 24, 2021 Report p. 11 ¶ 35 (Benzene is an industrial chemical, a component of gasoline and cigarette smoke, a contaminant in mixtures of organic solvents and glues, and a widespread environmental contaminant. . . [which has been estimated to] cause as much as 8</w:t>
+        <w:t xml:space="preserve">Rose Report, Id. n. 15. See also, Martyn Smith June 24, 2021 Report p. 11 ¶ 35 (Benzene is an industrial chemical, a component of gasoline and cigarette smoke, a contaminant in mixtures of organic solvents and glues, and a widespread environmental contaminant. . . [which has been estimated to] cause as much as 8</w:t>
       </w:r>
       <w:r>
         <w:noBreakHyphen/>
@@ -10975,13 +10886,7 @@
         <w:noBreakHyphen/>
       </w:r>
       <w:r>
-        <w:t xml:space="preserve">19 ¶¶ 40</w:t>
-      </w:r>
-      <w:r>
-        <w:noBreakHyphen/>
-      </w:r>
-      <w:r>
-        <w:t xml:space="preserve">54, R.A. 000100</w:t>
+        <w:t xml:space="preserve">19 ¶¶ 40-⁠54, R.A. 000100</w:t>
       </w:r>
       <w:r>
         <w:noBreakHyphen/>
@@ -12194,6 +12099,7 @@
     <w:unhideWhenUsed/>
     <w:qFormat/>
     <w:pPr>
+      <w:keepLines/>
       <w:spacing w:before="0" w:after="140" w:line="276" w:lineRule="exact"/>
     </w:pPr>
     <w:rPr>
@@ -12392,6 +12298,15 @@
       <w:ind w:firstLine="0"/>
     </w:pPr>
   </w:style>
+  <w:style w:type="paragraph" w:customStyle="1" w:styleId="BodyTextKeep">
+    <w:name w:val="Body Text Keep"/>
+    <w:basedOn w:val="BodyText"/>
+    <w:qFormat/>
+    <w:pPr>
+      <w:keepNext/>
+      <w:keepLines/>
+    </w:pPr>
+  </w:style>
   <w:style w:type="paragraph" w:customStyle="1" w:styleId="XdList1">
     <w:name w:val="XdList 1"/>
     <w:basedOn w:val="Normal"/>
@@ -12444,6 +12359,33 @@
     <w:pPr>
       <w:spacing w:before="0" w:after="0" w:line="276" w:lineRule="exact"/>
       <w:ind w:left="2160" w:hanging="720"/>
+    </w:pPr>
+  </w:style>
+  <w:style w:type="paragraph" w:customStyle="1" w:styleId="XdQuoteList1">
+    <w:name w:val="Xd Quote List 1"/>
+    <w:basedOn w:val="Normal"/>
+    <w:qFormat/>
+    <w:pPr>
+      <w:spacing w:before="0" w:after="0" w:line="276" w:lineRule="exact"/>
+      <w:ind w:left="1440" w:right="720" w:hanging="720"/>
+    </w:pPr>
+  </w:style>
+  <w:style w:type="paragraph" w:customStyle="1" w:styleId="XdQuoteList2">
+    <w:name w:val="Xd Quote List 2"/>
+    <w:basedOn w:val="Normal"/>
+    <w:qFormat/>
+    <w:pPr>
+      <w:spacing w:before="0" w:after="0" w:line="276" w:lineRule="exact"/>
+      <w:ind w:left="2160" w:right="720" w:hanging="720"/>
+    </w:pPr>
+  </w:style>
+  <w:style w:type="paragraph" w:customStyle="1" w:styleId="XdQuoteList3">
+    <w:name w:val="Xd Quote List 3"/>
+    <w:basedOn w:val="Normal"/>
+    <w:qFormat/>
+    <w:pPr>
+      <w:spacing w:before="0" w:after="0" w:line="276" w:lineRule="exact"/>
+      <w:ind w:left="2880" w:right="720" w:hanging="720"/>
     </w:pPr>
   </w:style>
   <w:style w:type="paragraph" w:customStyle="1" w:styleId="XdList1">

</xml_diff>